<commit_message>
fix: update English markdown with three additions + regenerate PDFs
- Added Three Key Additions section after Executive Summary
- Added Paadi Veedu Kitchen to Executive Summary table and headline numbers
- Added Section 2.6 Water Sports Jetty & Electric Boat
- Added Section 6.9 Kadamban Moothan & Organic Theater
- Updated 51-item feast venue to Paadi Veedu Kitchen
- Updated package roadmap with Kitchen, Boat, Theater milestones
- Updated itinerary with electric boat cruise and Kitchen meal
- Updated budget with Kitchen (₹3-5L) and Jetty/Boat (₹4-7L) lines
- Updated revenue streams to include Food & Restaurant, Water Sports, Organic Theater
- Regenerated English PDF (95 KB) and DOCX (53 KB)
</commit_message>
<xml_diff>
--- a/pokkali-village-report-en.docx
+++ b/pokkali-village-report-en.docx
@@ -171,7 +171,7 @@
               <w:rPr>
                 <w:sz w:val="18"/>
               </w:rPr>
-              <w:t>A 18-month Agro Ecosystem Restoration programme: 51 pilot homes scaling to 2,500 homes; zero-chemical kitchen gardens; a recurring 51-item feast cooked in individual households and served in a common space; closed-loop waste management</w:t>
+              <w:t>A 18-month Agro Ecosystem Restoration programme: 51 pilot homes scaling to 2,500 homes; zero-chemical kitchen gardens; a recurring 51-item feast cooked in individual households and served at Paadi Veedu Kitchen — an ethnic restaurant built in traditional Kerala style, run by women's SHGs; closed-loop waste management</w:t>
             </w:r>
           </w:p>
         </w:tc>
@@ -179,7 +179,7 @@
     </w:tbl>
     <w:p>
       <w:r>
-        <w:t>Headline numbers. 51 pilot households; 2,500 households at full scale (18 months); a 3,000-year-old rice-prawn farming heritage; a 51-item community feast; zero chemicals, zero waste to landfill; a soft launch on 25 June 2026 in the presence of the District Collector, Ernakulam.</w:t>
+        <w:t>Headline numbers. 51 pilot households; 2,500 households at full scale (18 months); a 3,000-year-old rice-prawn farming heritage; a 51-item community feast served at Paadi Veedu Kitchen — an ethnic restaurant in traditional Kerala style; Kerala's first zero-noise, zero-emission electric boat at the Water Sports Jetty; weekly Organic Theater performances by Kadamban Moothan; zero chemicals, zero waste to landfill; a soft launch on 25 June 2026 in the presence of the District Collector, Ernakulam.</w:t>
       </w:r>
     </w:p>
     <w:p>
@@ -190,6 +190,64 @@
     <w:p>
       <w:r>
         <w:t>Soft launch, 25 June 2026. A closed-group preview at Ezhikkara with the District Collector as the special guest, featuring a half-day tour walkthrough, a live mobile-app booking demo, and a sample of the 51-item feast.</w:t>
+      </w:r>
+    </w:p>
+    <w:p>
+      <w:pPr/>
+      <w:r>
+        <w:br/>
+      </w:r>
+    </w:p>
+    <w:p>
+      <w:pPr>
+        <w:pStyle w:val="Heading1"/>
+      </w:pPr>
+      <w:r>
+        <w:t>Three Key Additions</w:t>
+      </w:r>
+    </w:p>
+    <w:p>
+      <w:r>
+        <w:t>Three strategic additions transform Pokkali Village from a farm visit into a full-day destination:</w:t>
+      </w:r>
+    </w:p>
+    <w:p>
+      <w:pPr>
+        <w:pStyle w:val="Heading2"/>
+      </w:pPr>
+      <w:r>
+        <w:t>Paadi Veedu Kitchen — The Ethnic Restaurant</w:t>
+      </w:r>
+    </w:p>
+    <w:p>
+      <w:r>
+        <w:t>Paadi Veedu Kitchen is a dedicated ethnic restaurant built in traditional Kerala architectural style — thatched roof, open-air dining, banana-leaf service, and a visible traditional kitchen where guests see their food being prepared. Not a canteen. Not a buffet. A dedicated community dining experience. Capacity: 40–60 guests per seating. The recurring 51-item Pokkali feast is served here weekly, each dish prepared by a different household and assembled by women's SHGs. The restaurant is the culinary, cultural, and commercial heart of Paadi Veedu — where 51 households serve the 3,000-year story on a banana leaf.</w:t>
+      </w:r>
+    </w:p>
+    <w:p>
+      <w:pPr>
+        <w:pStyle w:val="Heading2"/>
+      </w:pPr>
+      <w:r>
+        <w:t>Water Sports Jetty &amp; Electric Boat — Zero-Emission Tourism</w:t>
+      </w:r>
+    </w:p>
+    <w:p>
+      <w:r>
+        <w:t>A dedicated backwater jetty at Ezhikkara serves as the PAADI Tales tour starting point and offers kayaking, traditional canoe rides, and Kerala's first zero-noise, zero-emission electric boat (arriving July 2026). The jetty also enables sunset cruises, birdwatching from water, and photography tours — expanding the visitor experience beyond the farm walk into the backwaters. The electric boat provides a unique, silent, eco-friendly backwater experience that no other destination in Kerala can match.</w:t>
+      </w:r>
+    </w:p>
+    <w:p>
+      <w:pPr>
+        <w:pStyle w:val="Heading2"/>
+      </w:pPr>
+      <w:r>
+        <w:t>Kadamban Moothan &amp; Organic Theater — Culture Meets Agriculture</w:t>
+      </w:r>
+    </w:p>
+    <w:p>
+      <w:r>
+        <w:t>Kadamban Moothan brings the "Organic Theater" to Pokkali Village — a weekly cultural performance at Paadi Veedu Kitchen that tells the 3,000-year Pokkali story through Kerala folk theater, Theyyam-inspired elements, and shadow puppetry. Visitors don't just see the fields — they experience the story live, performed by traditional artists. This bridges agricultural heritage with performing arts, creating a unique cultural offering that deepens the visitor connection to the Pokkali story.</w:t>
       </w:r>
     </w:p>
     <w:p>
@@ -1055,6 +1113,59 @@
       </w:r>
     </w:p>
     <w:p>
+      <w:pPr>
+        <w:pStyle w:val="Heading2"/>
+      </w:pPr>
+      <w:r>
+        <w:t>2.6 Water Sports Jetty &amp; Electric Boat</w:t>
+      </w:r>
+    </w:p>
+    <w:p>
+      <w:r>
+        <w:t>A dedicated backwater jetty at Ezhikkara serves as the PAADI Tales tour starting point and offers kayaking, traditional canoe rides, and electric boat cruises. The electric boat (arriving July 2026) provides a unique zero-noise, zero-emission backwater experience — the first of its kind in Kerala backwater tourism. The jetty also enables birdwatching from water and sunset cruises, expanding the visitor experience beyond the farm walk.</w:t>
+      </w:r>
+    </w:p>
+    <w:p>
+      <w:r>
+        <w:rPr>
+          <w:b/>
+        </w:rPr>
+        <w:t>Key features:</w:t>
+      </w:r>
+    </w:p>
+    <w:p>
+      <w:pPr>
+        <w:pStyle w:val="ListBullet"/>
+      </w:pPr>
+      <w:r>
+        <w:t>Electric boat arriving July 2026 — zero noise, zero emissions, unique in Kerala</w:t>
+      </w:r>
+    </w:p>
+    <w:p>
+      <w:pPr>
+        <w:pStyle w:val="ListBullet"/>
+      </w:pPr>
+      <w:r>
+        <w:t>Kayaking &amp; traditional canoe rides from the Ezhikkara jetty</w:t>
+      </w:r>
+    </w:p>
+    <w:p>
+      <w:pPr>
+        <w:pStyle w:val="ListBullet"/>
+      </w:pPr>
+      <w:r>
+        <w:t>Sunset cruises and birdwatching from water</w:t>
+      </w:r>
+    </w:p>
+    <w:p>
+      <w:pPr>
+        <w:pStyle w:val="ListBullet"/>
+      </w:pPr>
+      <w:r>
+        <w:t>Jetty doubles as the PAADI Tales tour starting point</w:t>
+      </w:r>
+    </w:p>
+    <w:p>
       <w:pPr/>
       <w:r>
         <w:br/>
@@ -1201,7 +1312,7 @@
               <w:rPr>
                 <w:sz w:val="18"/>
               </w:rPr>
-              <w:t>Welcome drink, guided farm walk, canoe ride, traditional meal at a household, farmer interaction</w:t>
+              <w:t>Welcome drink, guided farm walk, electric boat cruise, traditional meal at Paadi Veedu Kitchen, farmer interaction</w:t>
             </w:r>
           </w:p>
         </w:tc>
@@ -1255,7 +1366,7 @@
               <w:rPr>
                 <w:sz w:val="18"/>
               </w:rPr>
-              <w:t>Stay, sunset canoe, cooking class, breakfast, campfire</w:t>
+              <w:t>Stay, sunset electric boat cruise, cooking class, breakfast, campfire</w:t>
             </w:r>
           </w:p>
         </w:tc>
@@ -1309,7 +1420,7 @@
               <w:rPr>
                 <w:sz w:val="18"/>
               </w:rPr>
-              <w:t>Farming, conservation, kayaking, Ayurveda, birdwatching, all meals</w:t>
+              <w:t>Farming, conservation, kayaking, Ayurveda, birdwatching, Organic Theater, all meals at Paadi Veedu Kitchen</w:t>
             </w:r>
           </w:p>
         </w:tc>
@@ -1467,7 +1578,7 @@
         <w:pStyle w:val="ListNumber"/>
       </w:pPr>
       <w:r>
-        <w:t>1:30 — Canoe ride through the Pokkali backwater canals. Photography, birdwatching, and an explanation of the carbon-sink and climate-resilience story.</w:t>
+        <w:t>1:30 — Water sports at the Pokkali jetty: electric boat cruise (zero-noise, zero-emission) and/or traditional canoe ride through the backwater canals. Photography, birdwatching, and an explanation of the carbon-sink and climate-resilience story.</w:t>
       </w:r>
     </w:p>
     <w:p>
@@ -1475,7 +1586,7 @@
         <w:pStyle w:val="ListNumber"/>
       </w:pPr>
       <w:r>
-        <w:t>2:30 — Traditional meal at a host household. A sit-down meal of Pokkali rice, prawn curry, fish thoran, banana-leaf sadya items — the meal is a preview of the recurring 51-item feast described in Section 4.</w:t>
+        <w:t>2:30 — Traditional meal at Paadi Veedu Kitchen. A sit-down meal of Pokkali rice, prawn curry, fish thoran, banana-leaf sadya items — the meal is a preview of the recurring 51-item feast described in Section 4.</w:t>
       </w:r>
     </w:p>
     <w:p>
@@ -2256,7 +2367,7 @@
               <w:rPr>
                 <w:sz w:val="18"/>
               </w:rPr>
-              <w:t>Hosted in common space; SHG-cooked</w:t>
+              <w:t>Hosted at Paadi Veedu Kitchen (ethnic restaurant, thatched roof, open-air); SHG-cooked</w:t>
             </w:r>
           </w:p>
         </w:tc>
@@ -2544,7 +2655,7 @@
               <w:rPr>
                 <w:sz w:val="18"/>
               </w:rPr>
-              <w:t>Pokkali Discovery (half-day) + Pokkali Cooking Class</w:t>
+              <w:t>Pokkali Discovery (half-day) + Pokkali Cooking Class + Water Sports Jetty operational</w:t>
             </w:r>
           </w:p>
         </w:tc>
@@ -2572,7 +2683,7 @@
               <w:rPr>
                 <w:sz w:val="18"/>
               </w:rPr>
-              <w:t>Overnight Farm Stay + Corporate CSR Outing</w:t>
+              <w:t>Overnight Farm Stay + Corporate CSR Outing + Paadi Veedu Kitchen opens + Organic Theater begins</w:t>
             </w:r>
           </w:p>
         </w:tc>
@@ -2600,7 +2711,7 @@
               <w:rPr>
                 <w:sz w:val="18"/>
               </w:rPr>
-              <w:t>3-Day Regenerative Retreat ("Soul of the Grain")</w:t>
+              <w:t>3-Day Regenerative Retreat ("Soul of the Grain") + Electric Boat arrives + Sunset cruises</w:t>
             </w:r>
           </w:p>
         </w:tc>
@@ -2628,7 +2739,7 @@
               <w:rPr>
                 <w:sz w:val="18"/>
               </w:rPr>
-              <w:t>Multi-day packages combined with Ayurveda, birdwatching, photography</w:t>
+              <w:t>Multi-day packages combined with Ayurveda, birdwatching, photography + Kadamban Moothan residency</w:t>
             </w:r>
           </w:p>
         </w:tc>
@@ -2763,7 +2874,7 @@
     </w:p>
     <w:p>
       <w:r>
-        <w:t>The 51-item feast is the culmirary, cultural and commercial expression of Paadi Veedu.</w:t>
+        <w:t>The 51-item feast is the culinary, cultural and commercial expression of Paadi Veedu.</w:t>
       </w:r>
     </w:p>
     <w:tbl>
@@ -2858,7 +2969,7 @@
               <w:rPr>
                 <w:sz w:val="18"/>
               </w:rPr>
-              <w:t>A common dining space in Ezhikkara (open-air, traditional)</w:t>
+              <w:t>Paadi Veedu Kitchen — an ethnic restaurant at Ezhikkara, built in traditional Kerala style (thatched roof, open-air, banana-leaf service, visible kitchen). Capacity: 40–60 guests per seating.</w:t>
             </w:r>
           </w:p>
         </w:tc>
@@ -2886,7 +2997,7 @@
               <w:rPr>
                 <w:sz w:val="18"/>
               </w:rPr>
-              <w:t>Each item is cooked in an individual host household; assembled and served in the common space</w:t>
+              <w:t>Each item is cooked in an individual host household; assembled and served at Paadi Veedu Kitchen, an ethnic restaurant run by women's SHGs</w:t>
             </w:r>
           </w:p>
         </w:tc>
@@ -4075,6 +4186,54 @@
       </w:r>
     </w:p>
     <w:p>
+      <w:pPr>
+        <w:pStyle w:val="Heading2"/>
+      </w:pPr>
+      <w:r>
+        <w:t>6.9 Kadamban Moothan &amp; Organic Theater</w:t>
+      </w:r>
+    </w:p>
+    <w:p>
+      <w:r>
+        <w:rPr>
+          <w:b/>
+        </w:rPr>
+        <w:t>Kadamban Moothan is a cultural partner performing weekly "Organic Theater" at Paadi Veedu Kitchen. The performances tell the 3,000-year Pokkali story through Kerala folk theater, Theyyam-inspired elements, and shadow puppetry. Specific contributions:</w:t>
+      </w:r>
+    </w:p>
+    <w:p>
+      <w:pPr>
+        <w:pStyle w:val="ListBullet"/>
+      </w:pPr>
+      <w:r>
+        <w:t>Weekly "Organic Theater" performances at Paadi Veedu Kitchen telling the Pokkali story live.</w:t>
+      </w:r>
+    </w:p>
+    <w:p>
+      <w:pPr>
+        <w:pStyle w:val="ListBullet"/>
+      </w:pPr>
+      <w:r>
+        <w:t>Bridges agricultural heritage with performing arts, creating a unique cultural offering for visitors.</w:t>
+      </w:r>
+    </w:p>
+    <w:p>
+      <w:pPr>
+        <w:pStyle w:val="ListBullet"/>
+      </w:pPr>
+      <w:r>
+        <w:t>Traditional artists perform Kerala folk theater, Theyyam-inspired elements, and shadow puppetry.</w:t>
+      </w:r>
+    </w:p>
+    <w:p>
+      <w:pPr>
+        <w:pStyle w:val="ListBullet"/>
+      </w:pPr>
+      <w:r>
+        <w:t>Visitors experience the Pokkali story live — not just on a poster or a screen.</w:t>
+      </w:r>
+    </w:p>
+    <w:p>
       <w:pPr/>
       <w:r>
         <w:br/>
@@ -4208,6 +4367,88 @@
               <w:rPr>
                 <w:sz w:val="18"/>
               </w:rPr>
+              <w:t>Paadi Veedu Kitchen (ethnic restaurant build-out, FSSAI kitchen, equipment)</w:t>
+            </w:r>
+          </w:p>
+        </w:tc>
+        <w:tc>
+          <w:tcPr>
+            <w:tcW w:type="dxa" w:w="3135"/>
+          </w:tcPr>
+          <w:p>
+            <w:r>
+              <w:rPr>
+                <w:sz w:val="18"/>
+              </w:rPr>
+              <w:t>₹3,00,000 – ₹5,00,000</w:t>
+            </w:r>
+          </w:p>
+        </w:tc>
+        <w:tc>
+          <w:tcPr>
+            <w:tcW w:type="dxa" w:w="3135"/>
+          </w:tcPr>
+          <w:p>
+            <w:r>
+              <w:rPr>
+                <w:sz w:val="18"/>
+              </w:rPr>
+              <w:t>Thatched roof, open-air dining, banana-leaf service, visible kitchen</w:t>
+            </w:r>
+          </w:p>
+        </w:tc>
+      </w:tr>
+      <w:tr>
+        <w:tc>
+          <w:tcPr>
+            <w:tcW w:type="dxa" w:w="3135"/>
+          </w:tcPr>
+          <w:p>
+            <w:r>
+              <w:rPr>
+                <w:sz w:val="18"/>
+              </w:rPr>
+              <w:t>Water Sports Jetty &amp; Electric Boat (jetty construction, electric boat, kayaks, canoes)</w:t>
+            </w:r>
+          </w:p>
+        </w:tc>
+        <w:tc>
+          <w:tcPr>
+            <w:tcW w:type="dxa" w:w="3135"/>
+          </w:tcPr>
+          <w:p>
+            <w:r>
+              <w:rPr>
+                <w:sz w:val="18"/>
+              </w:rPr>
+              <w:t>₹4,00,000 – ₹7,00,000</w:t>
+            </w:r>
+          </w:p>
+        </w:tc>
+        <w:tc>
+          <w:tcPr>
+            <w:tcW w:type="dxa" w:w="3135"/>
+          </w:tcPr>
+          <w:p>
+            <w:r>
+              <w:rPr>
+                <w:sz w:val="18"/>
+              </w:rPr>
+              <w:t>Electric boat arriving July 2026; kayaks and canoes ready by Month 3</w:t>
+            </w:r>
+          </w:p>
+        </w:tc>
+      </w:tr>
+      <w:tr>
+        <w:tc>
+          <w:tcPr>
+            <w:tcW w:type="dxa" w:w="3135"/>
+          </w:tcPr>
+          <w:p>
+            <w:r>
+              <w:rPr>
+                <w:sz w:val="18"/>
+              </w:rPr>
               <w:t>Mobile app + digital stack (build, payment gateway, CRM, WhatsApp API)</w:t>
             </w:r>
           </w:p>
@@ -4614,7 +4855,7 @@
               <w:rPr>
                 <w:sz w:val="18"/>
               </w:rPr>
-              <w:t>45%</w:t>
+              <w:t>40%</w:t>
             </w:r>
           </w:p>
         </w:tc>
@@ -4655,7 +4896,7 @@
               <w:rPr>
                 <w:sz w:val="18"/>
               </w:rPr>
-              <w:t>20%</w:t>
+              <w:t>18%</w:t>
             </w:r>
           </w:p>
         </w:tc>
@@ -4683,7 +4924,7 @@
               <w:rPr>
                 <w:sz w:val="18"/>
               </w:rPr>
-              <w:t>51-item feast + homestay accommodation</w:t>
+              <w:t>Food &amp; Restaurant (51-item feast + Paadi Veedu Kitchen)</w:t>
             </w:r>
           </w:p>
         </w:tc>
@@ -4709,7 +4950,7 @@
               <w:rPr>
                 <w:sz w:val="18"/>
               </w:rPr>
-              <w:t>Multi-day packages + recurring community feast</w:t>
+              <w:t>Weekly feast at ethnic restaurant; SHG-cooked</w:t>
             </w:r>
           </w:p>
         </w:tc>
@@ -4724,7 +4965,7 @@
               <w:rPr>
                 <w:sz w:val="18"/>
               </w:rPr>
-              <w:t>E-commerce (Pokkali rice, prawn pickle, coir)</w:t>
+              <w:t>51-item feast + homestay accommodation</w:t>
             </w:r>
           </w:p>
         </w:tc>
@@ -4750,7 +4991,7 @@
               <w:rPr>
                 <w:sz w:val="18"/>
               </w:rPr>
-              <w:t>Recurring, shippable nationally</w:t>
+              <w:t>Multi-day packages + recurring community feast</w:t>
             </w:r>
           </w:p>
         </w:tc>
@@ -4765,7 +5006,7 @@
               <w:rPr>
                 <w:sz w:val="18"/>
               </w:rPr>
-              <w:t>Corporate / CSR</w:t>
+              <w:t>E-commerce (Pokkali rice, prawn pickle, coir)</w:t>
             </w:r>
           </w:p>
         </w:tc>
@@ -4778,7 +5019,7 @@
               <w:rPr>
                 <w:sz w:val="18"/>
               </w:rPr>
-              <w:t>7%</w:t>
+              <w:t>8%</w:t>
             </w:r>
           </w:p>
         </w:tc>
@@ -4791,7 +5032,7 @@
               <w:rPr>
                 <w:sz w:val="18"/>
               </w:rPr>
-              <w:t>High LTV, B2B</w:t>
+              <w:t>Recurring, shippable nationally</w:t>
             </w:r>
           </w:p>
         </w:tc>
@@ -4806,6 +5047,88 @@
               <w:rPr>
                 <w:sz w:val="18"/>
               </w:rPr>
+              <w:t>Corporate / CSR</w:t>
+            </w:r>
+          </w:p>
+        </w:tc>
+        <w:tc>
+          <w:tcPr>
+            <w:tcW w:type="dxa" w:w="3135"/>
+          </w:tcPr>
+          <w:p>
+            <w:r>
+              <w:rPr>
+                <w:sz w:val="18"/>
+              </w:rPr>
+              <w:t>5%</w:t>
+            </w:r>
+          </w:p>
+        </w:tc>
+        <w:tc>
+          <w:tcPr>
+            <w:tcW w:type="dxa" w:w="3135"/>
+          </w:tcPr>
+          <w:p>
+            <w:r>
+              <w:rPr>
+                <w:sz w:val="18"/>
+              </w:rPr>
+              <w:t>High LTV, B2B</w:t>
+            </w:r>
+          </w:p>
+        </w:tc>
+      </w:tr>
+      <w:tr>
+        <w:tc>
+          <w:tcPr>
+            <w:tcW w:type="dxa" w:w="3135"/>
+          </w:tcPr>
+          <w:p>
+            <w:r>
+              <w:rPr>
+                <w:sz w:val="18"/>
+              </w:rPr>
+              <w:t>Water sports &amp; electric boat experiences</w:t>
+            </w:r>
+          </w:p>
+        </w:tc>
+        <w:tc>
+          <w:tcPr>
+            <w:tcW w:type="dxa" w:w="3135"/>
+          </w:tcPr>
+          <w:p>
+            <w:r>
+              <w:rPr>
+                <w:sz w:val="18"/>
+              </w:rPr>
+              <w:t>4%</w:t>
+            </w:r>
+          </w:p>
+        </w:tc>
+        <w:tc>
+          <w:tcPr>
+            <w:tcW w:type="dxa" w:w="3135"/>
+          </w:tcPr>
+          <w:p>
+            <w:r>
+              <w:rPr>
+                <w:sz w:val="18"/>
+              </w:rPr>
+              <w:t>Jetty-based; kayaking, canoe, electric boat cruises</w:t>
+            </w:r>
+          </w:p>
+        </w:tc>
+      </w:tr>
+      <w:tr>
+        <w:tc>
+          <w:tcPr>
+            <w:tcW w:type="dxa" w:w="3135"/>
+          </w:tcPr>
+          <w:p>
+            <w:r>
+              <w:rPr>
+                <w:sz w:val="18"/>
+              </w:rPr>
               <w:t>Add-ons (photographer, Ayurveda, transport)</w:t>
             </w:r>
           </w:p>
@@ -4833,6 +5156,47 @@
                 <w:sz w:val="18"/>
               </w:rPr>
               <w:t>Pure margin</w:t>
+            </w:r>
+          </w:p>
+        </w:tc>
+      </w:tr>
+      <w:tr>
+        <w:tc>
+          <w:tcPr>
+            <w:tcW w:type="dxa" w:w="3135"/>
+          </w:tcPr>
+          <w:p>
+            <w:r>
+              <w:rPr>
+                <w:sz w:val="18"/>
+              </w:rPr>
+              <w:t>Organic Theater (ticket + food bundle)</w:t>
+            </w:r>
+          </w:p>
+        </w:tc>
+        <w:tc>
+          <w:tcPr>
+            <w:tcW w:type="dxa" w:w="3135"/>
+          </w:tcPr>
+          <w:p>
+            <w:r>
+              <w:rPr>
+                <w:sz w:val="18"/>
+              </w:rPr>
+              <w:t>2%</w:t>
+            </w:r>
+          </w:p>
+        </w:tc>
+        <w:tc>
+          <w:tcPr>
+            <w:tcW w:type="dxa" w:w="3135"/>
+          </w:tcPr>
+          <w:p>
+            <w:r>
+              <w:rPr>
+                <w:sz w:val="18"/>
+              </w:rPr>
+              <w:t>Kadamban Moothan weekly performances</w:t>
             </w:r>
           </w:p>
         </w:tc>

</xml_diff>